<commit_message>
Add reusable resources and library indexes
</commit_message>
<xml_diff>
--- a/packs/1st-pinelands/programmes/2026-10-30-musical-instruments-programme.docx
+++ b/packs/1st-pinelands/programmes/2026-10-30-musical-instruments-programme.docx
@@ -1221,9 +1221,6 @@
               <w:spacing w:lineRule="auto" w:line="240"/>
               <w:rPr/>
             </w:pPr>
-            <w:r>
-              <w:rPr/>
-            </w:r>
           </w:p>
         </w:tc>
       </w:tr>
@@ -1345,9 +1342,6 @@
               <w:spacing w:lineRule="auto" w:line="240"/>
               <w:rPr/>
             </w:pPr>
-            <w:r>
-              <w:rPr/>
-            </w:r>
           </w:p>
         </w:tc>
       </w:tr>
@@ -1477,10 +1471,9 @@
             </w:pPr>
             <w:r>
               <w:rPr>
-                <w:position w:val="0"/>
-                <w:sz w:val="22"/>
-                <w:vertAlign w:val="baseline"/>
-              </w:rPr>
+                <w:i/>
+              </w:rPr>
+              <w:t xml:space="preserve">The next morning, Nandi returned to the hall. On a table she found clean boxes and elastic bands left over from packing. Sam tapped the table. Could ordinary things help them answer last night’s question? Let’s see what the children can make.</w:t>
             </w:r>
           </w:p>
         </w:tc>
@@ -1616,10 +1609,9 @@
             </w:pPr>
             <w:r>
               <w:rPr>
-                <w:position w:val="0"/>
-                <w:sz w:val="22"/>
-                <w:vertAlign w:val="baseline"/>
-              </w:rPr>
+                <w:i/>
+              </w:rPr>
+              <w:t xml:space="preserve">A gentle pluck made the first sound. Sam stopped and listened closely. Would every band sound the same? The children took turns trying their new instruments.</w:t>
             </w:r>
           </w:p>
         </w:tc>
@@ -1699,6 +1691,59 @@
       </w:tr>
       <w:tr>
         <w:trPr>
+          <w:trHeight w:val="420" w:hRule="atLeast"/>
+        </w:trPr>
+        <w:tc>
+          <w:tcPr>
+            <w:tcW w:w="1169" w:type="dxa"/>
+            <w:tcBorders>
+              <w:top w:val="single" w:sz="8" w:space="0" w:color="000000"/>
+              <w:start w:val="single" w:sz="8" w:space="0" w:color="000000"/>
+              <w:bottom w:val="single" w:sz="8" w:space="0" w:color="000000"/>
+              <w:end w:val="single" w:sz="8" w:space="0" w:color="000000"/>
+            </w:tcBorders>
+            <w:shd w:fill="auto" w:val="clear"/>
+          </w:tcPr>
+          <w:p>
+            <w:pPr>
+              <w:pStyle w:val="normal1"/>
+              <w:spacing w:lineRule="auto" w:line="240"/>
+              <w:rPr/>
+            </w:pPr>
+            <w:r>
+              <w:rPr/>
+            </w:r>
+          </w:p>
+        </w:tc>
+        <w:tc>
+          <w:tcPr>
+            <w:tcW w:w="9436" w:type="dxa"/>
+            <w:gridSpan w:val="3"/>
+            <w:tcBorders>
+              <w:top w:val="single" w:sz="8" w:space="0" w:color="000000"/>
+              <w:start w:val="single" w:sz="8" w:space="0" w:color="000000"/>
+              <w:bottom w:val="single" w:sz="8" w:space="0" w:color="000000"/>
+              <w:end w:val="single" w:sz="8" w:space="0" w:color="000000"/>
+            </w:tcBorders>
+            <w:shd w:fill="auto" w:val="clear"/>
+          </w:tcPr>
+          <w:p>
+            <w:pPr>
+              <w:pStyle w:val="normal1"/>
+              <w:spacing w:lineRule="auto" w:line="240"/>
+              <w:rPr/>
+            </w:pPr>
+            <w:r>
+              <w:rPr>
+                <w:i/>
+              </w:rPr>
+              <w:t xml:space="preserve">Before the children could decide which sounds belonged together, the village bell rang: the guests were on their way. Each Six needed a short pattern they could play together before the doors opened.</w:t>
+            </w:r>
+          </w:p>
+        </w:tc>
+      </w:tr>
+      <w:tr>
+        <w:trPr>
           <w:trHeight w:val="165" w:hRule="atLeast"/>
         </w:trPr>
         <w:tc>
@@ -1766,6 +1811,59 @@
           <w:p>
             <w:r>
               <w:t>Finished instruments</w:t>
+            </w:r>
+          </w:p>
+        </w:tc>
+      </w:tr>
+      <w:tr>
+        <w:trPr>
+          <w:trHeight w:val="420" w:hRule="atLeast"/>
+        </w:trPr>
+        <w:tc>
+          <w:tcPr>
+            <w:tcW w:w="1169" w:type="dxa"/>
+            <w:tcBorders>
+              <w:top w:val="single" w:sz="8" w:space="0" w:color="000000"/>
+              <w:start w:val="single" w:sz="8" w:space="0" w:color="000000"/>
+              <w:bottom w:val="single" w:sz="8" w:space="0" w:color="000000"/>
+              <w:end w:val="single" w:sz="8" w:space="0" w:color="000000"/>
+            </w:tcBorders>
+            <w:shd w:fill="auto" w:val="clear"/>
+          </w:tcPr>
+          <w:p>
+            <w:pPr>
+              <w:pStyle w:val="normal1"/>
+              <w:spacing w:lineRule="auto" w:line="240"/>
+              <w:rPr/>
+            </w:pPr>
+            <w:r>
+              <w:rPr/>
+            </w:r>
+          </w:p>
+        </w:tc>
+        <w:tc>
+          <w:tcPr>
+            <w:tcW w:w="9436" w:type="dxa"/>
+            <w:gridSpan w:val="3"/>
+            <w:tcBorders>
+              <w:top w:val="single" w:sz="8" w:space="0" w:color="000000"/>
+              <w:start w:val="single" w:sz="8" w:space="0" w:color="000000"/>
+              <w:bottom w:val="single" w:sz="8" w:space="0" w:color="000000"/>
+              <w:end w:val="single" w:sz="8" w:space="0" w:color="000000"/>
+            </w:tcBorders>
+            <w:shd w:fill="auto" w:val="clear"/>
+          </w:tcPr>
+          <w:p>
+            <w:pPr>
+              <w:pStyle w:val="normal1"/>
+              <w:spacing w:lineRule="auto" w:line="240"/>
+              <w:rPr/>
+            </w:pPr>
+            <w:r>
+              <w:rPr>
+                <w:i/>
+              </w:rPr>
+              <w:t xml:space="preserve">The guests tapped along and cheered. The children thanked one another for listening, taking turns and sharing their sounds. Nandi smiled: “Each of us brought one small sound, and together we made a welcome.”</w:t>
             </w:r>
           </w:p>
         </w:tc>
@@ -2063,51 +2161,33 @@
       </w:r>
     </w:p>
     <w:p>
-      <w:pPr>
-        <w:pStyle w:val="Normal"/>
-      </w:pPr>
       <w:r>
-        <w:t>In a small village, the children were helping prepare for a welcome evening. They wanted to make music, but there were no drums or bells in the hall. “We can listen for sounds around us,” said Nandi. She tapped a clean cardboard box with one finger. It made a soft tok, tok, tok.</w:t>
+        <w:t xml:space="preserve">In a small village, the children were getting ready for a welcome evening. Everyone was busy sweeping, setting out chairs and hanging paper decorations. But something was missing: the musicians’ instruments had not arrived.</w:t>
       </w:r>
     </w:p>
     <w:p>
-      <w:pPr>
-        <w:pStyle w:val="Normal"/>
-      </w:pPr>
       <w:r>
-        <w:t>Sam stretched a loose elastic band around an empty box and plucked it gently. Boing! The sound was different from Nandi’s tapping. Lulo shook a sealed tin that an adult had brought, and it made a quiet shhh-shhh. Everyone took turns trying the sounds.</w:t>
+        <w:t xml:space="preserve">“The guests will be here tomorrow,” said Nandi. “How will we welcome them without music?”</w:t>
       </w:r>
     </w:p>
     <w:p>
-      <w:pPr>
-        <w:pStyle w:val="Normal"/>
-      </w:pPr>
       <w:r>
-        <w:t>At first they all played at once. The room became so noisy that nobody could hear the tune. Nandi raised her hand. “Let’s listen first,” she said. They chose a steady beat: tok, tok, pause, tok. One by one, the others added their sounds.</w:t>
+        <w:t xml:space="preserve">Sam sat quietly. Outside, he heard the wind rustle the leaves and rain tap on the roof. Inside, someone moved a chair: scrape. A box shifted on the floor: thump.</w:t>
       </w:r>
     </w:p>
     <w:p>
-      <w:pPr>
-        <w:pStyle w:val="Normal"/>
-      </w:pPr>
       <w:r>
-        <w:t>When one sound became too loud, its player softened it. When a friend lost the beat, the others waited and started again together. Soon the group had made a short piece of music. Each child had made a sound, and each had listened to someone else.</w:t>
+        <w:t xml:space="preserve">“There are sounds all around us,” said Lulo. Nandi listened. “Yes, but a sound is not yet a tune. Can we find a way to bring sounds together?”</w:t>
       </w:r>
     </w:p>
     <w:p>
-      <w:pPr>
-        <w:pStyle w:val="Normal"/>
-      </w:pPr>
       <w:r>
-        <w:t>At the welcome evening, the children played their music for the village. “The best part,” said Sam, “was making it together.” Nandi smiled. “And every instrument began with something simple.”</w:t>
+        <w:t xml:space="preserve">The children looked around the hall. They had a problem, but the evening was getting late. They promised to meet again in the morning and try to find an answer.</w:t>
       </w:r>
     </w:p>
     <w:p>
-      <w:pPr>
-        <w:pStyle w:val="Normal"/>
-      </w:pPr>
       <w:r>
-        <w:t>Ask: “What sounds did the children make?” “What helped them play together?” Explain that today everyone will make and play an instrument; Gold Cubs can show their own instrument and play it for the group.</w:t>
+        <w:t xml:space="preserve">Ask: “What problem did the children face?” “What sounds did they notice?” “How might they welcome the guests?”</w:t>
       </w:r>
     </w:p>
     <w:p>

</xml_diff>